<commit_message>
Add release steps to the instructions document
Co-Authored-By: Claude Opus 5.5 <noreply@anthropic.com>
</commit_message>
<xml_diff>
--- a/docs/Instructions for Sieve of Eratosthenes.docx
+++ b/docs/Instructions for Sieve of Eratosthenes.docx
@@ -350,6 +350,504 @@
           <w14:ligatures w14:val="none"/>
         </w:rPr>
         <w:t>.</w:t>
+      </w:r>
+    </w:p>
+    <w:p>
+      <w:pPr>
+        <w:spacing w:before="100" w:beforeAutospacing="1" w:after="100" w:afterAutospacing="1" w:line="240" w:lineRule="auto"/>
+        <w:rPr>
+          <w:rFonts w:ascii="Times New Roman" w:eastAsia="Times New Roman" w:hAnsi="Times New Roman" w:cs="Times New Roman"/>
+          <w:kern w:val="0"/>
+          <w14:ligatures w14:val="none"/>
+        </w:rPr>
+      </w:pPr>
+      <w:r>
+        <w:rPr>
+          <w:rFonts w:ascii="Times New Roman" w:eastAsia="Times New Roman" w:hAnsi="Times New Roman" w:cs="Times New Roman"/>
+          <w:kern w:val="0"/>
+          <w14:ligatures w14:val="none"/>
+        </w:rPr>
+        <w:t xml:space="preserve">RELEASE STEPS</w:t>
+      </w:r>
+    </w:p>
+    <w:p>
+      <w:pPr>
+        <w:spacing w:before="100" w:beforeAutospacing="1" w:after="100" w:afterAutospacing="1" w:line="240" w:lineRule="auto"/>
+        <w:rPr>
+          <w:rFonts w:ascii="Times New Roman" w:eastAsia="Times New Roman" w:hAnsi="Times New Roman" w:cs="Times New Roman"/>
+          <w:kern w:val="0"/>
+          <w14:ligatures w14:val="none"/>
+        </w:rPr>
+      </w:pPr>
+      <w:r>
+        <w:rPr>
+          <w:rFonts w:ascii="Times New Roman" w:eastAsia="Times New Roman" w:hAnsi="Times New Roman" w:cs="Times New Roman"/>
+          <w:kern w:val="0"/>
+          <w14:ligatures w14:val="none"/>
+        </w:rPr>
+        <w:t xml:space="preserve">To release a change to the tool, do these steps in order:</w:t>
+      </w:r>
+    </w:p>
+    <w:p>
+      <w:pPr>
+        <w:numPr>
+          <w:ilvl w:val="0"/>
+          <w:numId w:val="2"/>
+        </w:numPr>
+        <w:spacing w:before="100" w:beforeAutospacing="1" w:after="100" w:afterAutospacing="1" w:line="240" w:lineRule="auto"/>
+        <w:rPr>
+          <w:rFonts w:ascii="Times New Roman" w:eastAsia="Times New Roman" w:hAnsi="Times New Roman" w:cs="Times New Roman"/>
+          <w:kern w:val="0"/>
+          <w14:ligatures w14:val="none"/>
+        </w:rPr>
+      </w:pPr>
+      <w:r>
+        <w:rPr>
+          <w:rFonts w:ascii="Times New Roman" w:eastAsia="Times New Roman" w:hAnsi="Times New Roman" w:cs="Times New Roman"/>
+          <w:b/>
+          <w:bCs/>
+          <w:kern w:val="0"/>
+          <w14:ligatures w14:val="none"/>
+        </w:rPr>
+        <w:t xml:space="preserve">Edit </w:t>
+      </w:r>
+      <w:r>
+        <w:rPr>
+          <w:rFonts w:ascii="Courier New" w:eastAsia="Times New Roman" w:hAnsi="Courier New" w:cs="Courier New"/>
+          <w:kern w:val="0"/>
+          <w:sz w:val="20"/>
+          <w:szCs w:val="20"/>
+          <w14:ligatures w14:val="none"/>
+        </w:rPr>
+        <w:t xml:space="preserve">index.html</w:t>
+      </w:r>
+      <w:r>
+        <w:rPr>
+          <w:rFonts w:ascii="Times New Roman" w:eastAsia="Times New Roman" w:hAnsi="Times New Roman" w:cs="Times New Roman"/>
+          <w:b/>
+          <w:bCs/>
+          <w:kern w:val="0"/>
+          <w14:ligatures w14:val="none"/>
+        </w:rPr>
+        <w:t xml:space="preserve">.</w:t>
+      </w:r>
+      <w:r>
+        <w:rPr>
+          <w:rFonts w:ascii="Times New Roman" w:eastAsia="Times New Roman" w:hAnsi="Times New Roman" w:cs="Times New Roman"/>
+          <w:kern w:val="0"/>
+          <w14:ligatures w14:val="none"/>
+        </w:rPr>
+        <w:t xml:space="preserve"> It is the only file to change by hand.</w:t>
+      </w:r>
+    </w:p>
+    <w:p>
+      <w:pPr>
+        <w:numPr>
+          <w:ilvl w:val="0"/>
+          <w:numId w:val="2"/>
+        </w:numPr>
+        <w:spacing w:before="100" w:beforeAutospacing="1" w:after="100" w:afterAutospacing="1" w:line="240" w:lineRule="auto"/>
+        <w:rPr>
+          <w:rFonts w:ascii="Times New Roman" w:eastAsia="Times New Roman" w:hAnsi="Times New Roman" w:cs="Times New Roman"/>
+          <w:kern w:val="0"/>
+          <w14:ligatures w14:val="none"/>
+        </w:rPr>
+      </w:pPr>
+      <w:r>
+        <w:rPr>
+          <w:rFonts w:ascii="Times New Roman" w:eastAsia="Times New Roman" w:hAnsi="Times New Roman" w:cs="Times New Roman"/>
+          <w:b/>
+          <w:bCs/>
+          <w:kern w:val="0"/>
+          <w14:ligatures w14:val="none"/>
+        </w:rPr>
+        <w:t xml:space="preserve">Rebuild the artifact page.</w:t>
+      </w:r>
+      <w:r>
+        <w:rPr>
+          <w:rFonts w:ascii="Times New Roman" w:eastAsia="Times New Roman" w:hAnsi="Times New Roman" w:cs="Times New Roman"/>
+          <w:kern w:val="0"/>
+          <w14:ligatures w14:val="none"/>
+        </w:rPr>
+        <w:t xml:space="preserve"> Run </w:t>
+      </w:r>
+      <w:r>
+        <w:rPr>
+          <w:rFonts w:ascii="Courier New" w:eastAsia="Times New Roman" w:hAnsi="Courier New" w:cs="Courier New"/>
+          <w:kern w:val="0"/>
+          <w:sz w:val="20"/>
+          <w:szCs w:val="20"/>
+          <w14:ligatures w14:val="none"/>
+        </w:rPr>
+        <w:t xml:space="preserve">npm run artifact</w:t>
+      </w:r>
+      <w:r>
+        <w:rPr>
+          <w:rFonts w:ascii="Times New Roman" w:eastAsia="Times New Roman" w:hAnsi="Times New Roman" w:cs="Times New Roman"/>
+          <w:kern w:val="0"/>
+          <w14:ligatures w14:val="none"/>
+        </w:rPr>
+        <w:t xml:space="preserve"> in the project folder. It regenerates </w:t>
+      </w:r>
+      <w:r>
+        <w:rPr>
+          <w:rFonts w:ascii="Courier New" w:eastAsia="Times New Roman" w:hAnsi="Courier New" w:cs="Courier New"/>
+          <w:kern w:val="0"/>
+          <w:sz w:val="20"/>
+          <w:szCs w:val="20"/>
+          <w14:ligatures w14:val="none"/>
+        </w:rPr>
+        <w:t xml:space="preserve">sieve.html</w:t>
+      </w:r>
+      <w:r>
+        <w:rPr>
+          <w:rFonts w:ascii="Times New Roman" w:eastAsia="Times New Roman" w:hAnsi="Times New Roman" w:cs="Times New Roman"/>
+          <w:kern w:val="0"/>
+          <w14:ligatures w14:val="none"/>
+        </w:rPr>
+        <w:t xml:space="preserve"> from </w:t>
+      </w:r>
+      <w:r>
+        <w:rPr>
+          <w:rFonts w:ascii="Courier New" w:eastAsia="Times New Roman" w:hAnsi="Courier New" w:cs="Courier New"/>
+          <w:kern w:val="0"/>
+          <w:sz w:val="20"/>
+          <w:szCs w:val="20"/>
+          <w14:ligatures w14:val="none"/>
+        </w:rPr>
+        <w:t xml:space="preserve">index.html</w:t>
+      </w:r>
+      <w:r>
+        <w:rPr>
+          <w:rFonts w:ascii="Times New Roman" w:eastAsia="Times New Roman" w:hAnsi="Times New Roman" w:cs="Times New Roman"/>
+          <w:kern w:val="0"/>
+          <w14:ligatures w14:val="none"/>
+        </w:rPr>
+        <w:t xml:space="preserve">.</w:t>
+      </w:r>
+    </w:p>
+    <w:p>
+      <w:pPr>
+        <w:numPr>
+          <w:ilvl w:val="0"/>
+          <w:numId w:val="2"/>
+        </w:numPr>
+        <w:spacing w:before="100" w:beforeAutospacing="1" w:after="100" w:afterAutospacing="1" w:line="240" w:lineRule="auto"/>
+        <w:rPr>
+          <w:rFonts w:ascii="Times New Roman" w:eastAsia="Times New Roman" w:hAnsi="Times New Roman" w:cs="Times New Roman"/>
+          <w:kern w:val="0"/>
+          <w14:ligatures w14:val="none"/>
+        </w:rPr>
+      </w:pPr>
+      <w:r>
+        <w:rPr>
+          <w:rFonts w:ascii="Times New Roman" w:eastAsia="Times New Roman" w:hAnsi="Times New Roman" w:cs="Times New Roman"/>
+          <w:b/>
+          <w:bCs/>
+          <w:kern w:val="0"/>
+          <w14:ligatures w14:val="none"/>
+        </w:rPr>
+        <w:t xml:space="preserve">Republish the artifact.</w:t>
+      </w:r>
+      <w:r>
+        <w:rPr>
+          <w:rFonts w:ascii="Times New Roman" w:eastAsia="Times New Roman" w:hAnsi="Times New Roman" w:cs="Times New Roman"/>
+          <w:kern w:val="0"/>
+          <w14:ligatures w14:val="none"/>
+        </w:rPr>
+        <w:t xml:space="preserve"> Publish </w:t>
+      </w:r>
+      <w:r>
+        <w:rPr>
+          <w:rFonts w:ascii="Courier New" w:eastAsia="Times New Roman" w:hAnsi="Courier New" w:cs="Courier New"/>
+          <w:kern w:val="0"/>
+          <w:sz w:val="20"/>
+          <w:szCs w:val="20"/>
+          <w14:ligatures w14:val="none"/>
+        </w:rPr>
+        <w:t xml:space="preserve">sieve.html</w:t>
+      </w:r>
+      <w:r>
+        <w:rPr>
+          <w:rFonts w:ascii="Times New Roman" w:eastAsia="Times New Roman" w:hAnsi="Times New Roman" w:cs="Times New Roman"/>
+          <w:kern w:val="0"/>
+          <w14:ligatures w14:val="none"/>
+        </w:rPr>
+        <w:t xml:space="preserve"> to the existing artifact link so the link stays the same.</w:t>
+      </w:r>
+    </w:p>
+    <w:p>
+      <w:pPr>
+        <w:numPr>
+          <w:ilvl w:val="0"/>
+          <w:numId w:val="2"/>
+        </w:numPr>
+        <w:spacing w:before="100" w:beforeAutospacing="1" w:after="100" w:afterAutospacing="1" w:line="240" w:lineRule="auto"/>
+        <w:rPr>
+          <w:rFonts w:ascii="Times New Roman" w:eastAsia="Times New Roman" w:hAnsi="Times New Roman" w:cs="Times New Roman"/>
+          <w:kern w:val="0"/>
+          <w14:ligatures w14:val="none"/>
+        </w:rPr>
+      </w:pPr>
+      <w:r>
+        <w:rPr>
+          <w:rFonts w:ascii="Times New Roman" w:eastAsia="Times New Roman" w:hAnsi="Times New Roman" w:cs="Times New Roman"/>
+          <w:b/>
+          <w:bCs/>
+          <w:kern w:val="0"/>
+          <w14:ligatures w14:val="none"/>
+        </w:rPr>
+        <w:t xml:space="preserve">Commit and push.</w:t>
+      </w:r>
+      <w:r>
+        <w:rPr>
+          <w:rFonts w:ascii="Times New Roman" w:eastAsia="Times New Roman" w:hAnsi="Times New Roman" w:cs="Times New Roman"/>
+          <w:kern w:val="0"/>
+          <w14:ligatures w14:val="none"/>
+        </w:rPr>
+        <w:t xml:space="preserve"> Commit </w:t>
+      </w:r>
+      <w:r>
+        <w:rPr>
+          <w:rFonts w:ascii="Courier New" w:eastAsia="Times New Roman" w:hAnsi="Courier New" w:cs="Courier New"/>
+          <w:kern w:val="0"/>
+          <w:sz w:val="20"/>
+          <w:szCs w:val="20"/>
+          <w14:ligatures w14:val="none"/>
+        </w:rPr>
+        <w:t xml:space="preserve">index.html</w:t>
+      </w:r>
+      <w:r>
+        <w:rPr>
+          <w:rFonts w:ascii="Times New Roman" w:eastAsia="Times New Roman" w:hAnsi="Times New Roman" w:cs="Times New Roman"/>
+          <w:kern w:val="0"/>
+          <w14:ligatures w14:val="none"/>
+        </w:rPr>
+        <w:t xml:space="preserve"> and </w:t>
+      </w:r>
+      <w:r>
+        <w:rPr>
+          <w:rFonts w:ascii="Courier New" w:eastAsia="Times New Roman" w:hAnsi="Courier New" w:cs="Courier New"/>
+          <w:kern w:val="0"/>
+          <w:sz w:val="20"/>
+          <w:szCs w:val="20"/>
+          <w14:ligatures w14:val="none"/>
+        </w:rPr>
+        <w:t xml:space="preserve">sieve.html</w:t>
+      </w:r>
+      <w:r>
+        <w:rPr>
+          <w:rFonts w:ascii="Times New Roman" w:eastAsia="Times New Roman" w:hAnsi="Times New Roman" w:cs="Times New Roman"/>
+          <w:kern w:val="0"/>
+          <w14:ligatures w14:val="none"/>
+        </w:rPr>
+        <w:t xml:space="preserve">, then push to </w:t>
+      </w:r>
+      <w:r>
+        <w:rPr>
+          <w:rFonts w:ascii="Courier New" w:eastAsia="Times New Roman" w:hAnsi="Courier New" w:cs="Courier New"/>
+          <w:kern w:val="0"/>
+          <w:sz w:val="20"/>
+          <w:szCs w:val="20"/>
+          <w14:ligatures w14:val="none"/>
+        </w:rPr>
+        <w:t xml:space="preserve">main</w:t>
+      </w:r>
+      <w:r>
+        <w:rPr>
+          <w:rFonts w:ascii="Times New Roman" w:eastAsia="Times New Roman" w:hAnsi="Times New Roman" w:cs="Times New Roman"/>
+          <w:kern w:val="0"/>
+          <w14:ligatures w14:val="none"/>
+        </w:rPr>
+        <w:t xml:space="preserve"> in </w:t>
+      </w:r>
+      <w:r>
+        <w:rPr>
+          <w:rFonts w:ascii="Courier New" w:eastAsia="Times New Roman" w:hAnsi="Courier New" w:cs="Courier New"/>
+          <w:kern w:val="0"/>
+          <w:sz w:val="20"/>
+          <w:szCs w:val="20"/>
+          <w14:ligatures w14:val="none"/>
+        </w:rPr>
+        <w:t xml:space="preserve">winsomemundy/sieve-of-eratosthenes</w:t>
+      </w:r>
+      <w:r>
+        <w:rPr>
+          <w:rFonts w:ascii="Times New Roman" w:eastAsia="Times New Roman" w:hAnsi="Times New Roman" w:cs="Times New Roman"/>
+          <w:kern w:val="0"/>
+          <w14:ligatures w14:val="none"/>
+        </w:rPr>
+        <w:t xml:space="preserve"> on GitHub.</w:t>
+      </w:r>
+    </w:p>
+    <w:p>
+      <w:pPr>
+        <w:numPr>
+          <w:ilvl w:val="0"/>
+          <w:numId w:val="2"/>
+        </w:numPr>
+        <w:spacing w:before="100" w:beforeAutospacing="1" w:after="100" w:afterAutospacing="1" w:line="240" w:lineRule="auto"/>
+        <w:rPr>
+          <w:rFonts w:ascii="Times New Roman" w:eastAsia="Times New Roman" w:hAnsi="Times New Roman" w:cs="Times New Roman"/>
+          <w:kern w:val="0"/>
+          <w14:ligatures w14:val="none"/>
+        </w:rPr>
+      </w:pPr>
+      <w:r>
+        <w:rPr>
+          <w:rFonts w:ascii="Times New Roman" w:eastAsia="Times New Roman" w:hAnsi="Times New Roman" w:cs="Times New Roman"/>
+          <w:b/>
+          <w:bCs/>
+          <w:kern w:val="0"/>
+          <w14:ligatures w14:val="none"/>
+        </w:rPr>
+        <w:t xml:space="preserve">Check the live site.</w:t>
+      </w:r>
+      <w:r>
+        <w:rPr>
+          <w:rFonts w:ascii="Times New Roman" w:eastAsia="Times New Roman" w:hAnsi="Times New Roman" w:cs="Times New Roman"/>
+          <w:kern w:val="0"/>
+          <w14:ligatures w14:val="none"/>
+        </w:rPr>
+        <w:t xml:space="preserve"> Vercel builds and deploys automatically after the push, usually within a minute. Open sieve.winsomemundy.com and confirm the change appears.</w:t>
+      </w:r>
+    </w:p>
+    <w:p>
+      <w:pPr>
+        <w:spacing w:before="100" w:beforeAutospacing="1" w:after="100" w:afterAutospacing="1" w:line="240" w:lineRule="auto"/>
+        <w:rPr>
+          <w:rFonts w:ascii="Times New Roman" w:eastAsia="Times New Roman" w:hAnsi="Times New Roman" w:cs="Times New Roman"/>
+          <w:kern w:val="0"/>
+          <w14:ligatures w14:val="none"/>
+        </w:rPr>
+      </w:pPr>
+      <w:r>
+        <w:rPr>
+          <w:rFonts w:ascii="Times New Roman" w:eastAsia="Times New Roman" w:hAnsi="Times New Roman" w:cs="Times New Roman"/>
+          <w:kern w:val="0"/>
+          <w14:ligatures w14:val="none"/>
+        </w:rPr>
+        <w:t xml:space="preserve">To take a new design system release:</w:t>
+      </w:r>
+    </w:p>
+    <w:p>
+      <w:pPr>
+        <w:numPr>
+          <w:ilvl w:val="0"/>
+          <w:numId w:val="3"/>
+        </w:numPr>
+        <w:spacing w:before="100" w:beforeAutospacing="1" w:after="100" w:afterAutospacing="1" w:line="240" w:lineRule="auto"/>
+        <w:rPr>
+          <w:rFonts w:ascii="Times New Roman" w:eastAsia="Times New Roman" w:hAnsi="Times New Roman" w:cs="Times New Roman"/>
+          <w:kern w:val="0"/>
+          <w14:ligatures w14:val="none"/>
+        </w:rPr>
+      </w:pPr>
+      <w:r>
+        <w:rPr>
+          <w:rFonts w:ascii="Times New Roman" w:eastAsia="Times New Roman" w:hAnsi="Times New Roman" w:cs="Times New Roman"/>
+          <w:kern w:val="0"/>
+          <w14:ligatures w14:val="none"/>
+        </w:rPr>
+        <w:t xml:space="preserve">Change the </w:t>
+      </w:r>
+      <w:r>
+        <w:rPr>
+          <w:rFonts w:ascii="Courier New" w:eastAsia="Times New Roman" w:hAnsi="Courier New" w:cs="Courier New"/>
+          <w:kern w:val="0"/>
+          <w:sz w:val="20"/>
+          <w:szCs w:val="20"/>
+          <w14:ligatures w14:val="none"/>
+        </w:rPr>
+        <w:t xml:space="preserve">#v1.4.0</w:t>
+      </w:r>
+      <w:r>
+        <w:rPr>
+          <w:rFonts w:ascii="Times New Roman" w:eastAsia="Times New Roman" w:hAnsi="Times New Roman" w:cs="Times New Roman"/>
+          <w:kern w:val="0"/>
+          <w14:ligatures w14:val="none"/>
+        </w:rPr>
+        <w:t xml:space="preserve"> tag in </w:t>
+      </w:r>
+      <w:r>
+        <w:rPr>
+          <w:rFonts w:ascii="Courier New" w:eastAsia="Times New Roman" w:hAnsi="Courier New" w:cs="Courier New"/>
+          <w:kern w:val="0"/>
+          <w:sz w:val="20"/>
+          <w:szCs w:val="20"/>
+          <w14:ligatures w14:val="none"/>
+        </w:rPr>
+        <w:t xml:space="preserve">package.json</w:t>
+      </w:r>
+      <w:r>
+        <w:rPr>
+          <w:rFonts w:ascii="Times New Roman" w:eastAsia="Times New Roman" w:hAnsi="Times New Roman" w:cs="Times New Roman"/>
+          <w:kern w:val="0"/>
+          <w14:ligatures w14:val="none"/>
+        </w:rPr>
+        <w:t xml:space="preserve"> to the new release tag.</w:t>
+      </w:r>
+    </w:p>
+    <w:p>
+      <w:pPr>
+        <w:numPr>
+          <w:ilvl w:val="0"/>
+          <w:numId w:val="3"/>
+        </w:numPr>
+        <w:spacing w:before="100" w:beforeAutospacing="1" w:after="100" w:afterAutospacing="1" w:line="240" w:lineRule="auto"/>
+        <w:rPr>
+          <w:rFonts w:ascii="Times New Roman" w:eastAsia="Times New Roman" w:hAnsi="Times New Roman" w:cs="Times New Roman"/>
+          <w:kern w:val="0"/>
+          <w14:ligatures w14:val="none"/>
+        </w:rPr>
+      </w:pPr>
+      <w:r>
+        <w:rPr>
+          <w:rFonts w:ascii="Times New Roman" w:eastAsia="Times New Roman" w:hAnsi="Times New Roman" w:cs="Times New Roman"/>
+          <w:kern w:val="0"/>
+          <w14:ligatures w14:val="none"/>
+        </w:rPr>
+        <w:t xml:space="preserve">Run </w:t>
+      </w:r>
+      <w:r>
+        <w:rPr>
+          <w:rFonts w:ascii="Courier New" w:eastAsia="Times New Roman" w:hAnsi="Courier New" w:cs="Courier New"/>
+          <w:kern w:val="0"/>
+          <w:sz w:val="20"/>
+          <w:szCs w:val="20"/>
+          <w14:ligatures w14:val="none"/>
+        </w:rPr>
+        <w:t xml:space="preserve">npm install</w:t>
+      </w:r>
+      <w:r>
+        <w:rPr>
+          <w:rFonts w:ascii="Times New Roman" w:eastAsia="Times New Roman" w:hAnsi="Times New Roman" w:cs="Times New Roman"/>
+          <w:kern w:val="0"/>
+          <w14:ligatures w14:val="none"/>
+        </w:rPr>
+        <w:t xml:space="preserve">.</w:t>
+      </w:r>
+    </w:p>
+    <w:p>
+      <w:pPr>
+        <w:numPr>
+          <w:ilvl w:val="0"/>
+          <w:numId w:val="3"/>
+        </w:numPr>
+        <w:spacing w:before="100" w:beforeAutospacing="1" w:after="100" w:afterAutospacing="1" w:line="240" w:lineRule="auto"/>
+        <w:rPr>
+          <w:rFonts w:ascii="Times New Roman" w:eastAsia="Times New Roman" w:hAnsi="Times New Roman" w:cs="Times New Roman"/>
+          <w:kern w:val="0"/>
+          <w14:ligatures w14:val="none"/>
+        </w:rPr>
+      </w:pPr>
+      <w:r>
+        <w:rPr>
+          <w:rFonts w:ascii="Times New Roman" w:eastAsia="Times New Roman" w:hAnsi="Times New Roman" w:cs="Times New Roman"/>
+          <w:kern w:val="0"/>
+          <w14:ligatures w14:val="none"/>
+        </w:rPr>
+        <w:t xml:space="preserve">Follow the release steps above, starting at step 2.</w:t>
       </w:r>
     </w:p>
     <w:p/>
@@ -514,8 +1012,44 @@
       </w:rPr>
     </w:lvl>
   </w:abstractNum>
+  <w:abstractNum w:abstractNumId="1">
+    <w:multiLevelType w:val="hybridMultilevel"/>
+    <w:lvl w:ilvl="0">
+      <w:start w:val="1"/>
+      <w:numFmt w:val="decimal"/>
+      <w:lvlText w:val="%1."/>
+      <w:lvlJc w:val="left"/>
+      <w:pPr>
+        <w:tabs>
+          <w:tab w:val="num" w:pos="720"/>
+        </w:tabs>
+        <w:ind w:left="720" w:hanging="360"/>
+      </w:pPr>
+    </w:lvl>
+  </w:abstractNum>
+  <w:abstractNum w:abstractNumId="2">
+    <w:multiLevelType w:val="hybridMultilevel"/>
+    <w:lvl w:ilvl="0">
+      <w:start w:val="1"/>
+      <w:numFmt w:val="decimal"/>
+      <w:lvlText w:val="%1."/>
+      <w:lvlJc w:val="left"/>
+      <w:pPr>
+        <w:tabs>
+          <w:tab w:val="num" w:pos="720"/>
+        </w:tabs>
+        <w:ind w:left="720" w:hanging="360"/>
+      </w:pPr>
+    </w:lvl>
+  </w:abstractNum>
   <w:num w:numId="1" w16cid:durableId="942424313">
     <w:abstractNumId w:val="0"/>
+  </w:num>
+  <w:num w:numId="2">
+    <w:abstractNumId w:val="1"/>
+  </w:num>
+  <w:num w:numId="3">
+    <w:abstractNumId w:val="2"/>
   </w:num>
 </w:numbering>
 </file>

</xml_diff>

<commit_message>
Update the Word instructions' design-system release steps
Matches the requirements specification: install the new tag explicitly
so package-lock.json moves to the new commit, check the installed
version, and commit package.json and package-lock.json with sieve.html.

Co-Authored-By: Claude Opus 5.5 <noreply@anthropic.com>
</commit_message>
<xml_diff>
--- a/docs/Instructions for Sieve of Eratosthenes.docx
+++ b/docs/Instructions for Sieve of Eratosthenes.docx
@@ -215,7 +215,7 @@
           <w:kern w:val="0"/>
           <w14:ligatures w14:val="none"/>
         </w:rPr>
-        <w:t xml:space="preserve"> the artifact can’t load the design system package, so the script copies that package’s styles (the same v1.4.0 files the live site uses) into the page. Previously I had copied them in by hand.</w:t>
+        <w:t xml:space="preserve"> the artifact can’t load the design system package, so the script copies that package’s styles (the same files the live site uses, from the release pinned in package.json) into the page. Previously I had copied them in by hand.</w:t>
       </w:r>
     </w:p>
     <w:p>
@@ -749,25 +749,43 @@
           <w:kern w:val="0"/>
           <w14:ligatures w14:val="none"/>
         </w:rPr>
-        <w:t xml:space="preserve">Change the </w:t>
-      </w:r>
-      <w:r>
-        <w:rPr>
-          <w:rFonts w:ascii="Courier New" w:eastAsia="Times New Roman" w:hAnsi="Courier New" w:cs="Courier New"/>
-          <w:kern w:val="0"/>
-          <w:sz w:val="20"/>
-          <w:szCs w:val="20"/>
-          <w14:ligatures w14:val="none"/>
-        </w:rPr>
-        <w:t xml:space="preserve">#v1.4.0</w:t>
-      </w:r>
-      <w:r>
-        <w:rPr>
-          <w:rFonts w:ascii="Times New Roman" w:eastAsia="Times New Roman" w:hAnsi="Times New Roman" w:cs="Times New Roman"/>
-          <w:kern w:val="0"/>
-          <w14:ligatures w14:val="none"/>
-        </w:rPr>
-        <w:t xml:space="preserve"> tag in </w:t>
+        <w:t xml:space="preserve">Run </w:t>
+      </w:r>
+      <w:r>
+        <w:rPr>
+          <w:rFonts w:ascii="Courier New" w:eastAsia="Times New Roman" w:hAnsi="Courier New" w:cs="Courier New"/>
+          <w:kern w:val="0"/>
+          <w:sz w:val="20"/>
+          <w:szCs w:val="20"/>
+          <w14:ligatures w14:val="none"/>
+        </w:rPr>
+        <w:t xml:space="preserve">npm install github:winsomemundy/design-system#&lt;new tag&gt;</w:t>
+      </w:r>
+      <w:r>
+        <w:rPr>
+          <w:rFonts w:ascii="Times New Roman" w:eastAsia="Times New Roman" w:hAnsi="Times New Roman" w:cs="Times New Roman"/>
+          <w:kern w:val="0"/>
+          <w14:ligatures w14:val="none"/>
+        </w:rPr>
+        <w:t xml:space="preserve"> (for example </w:t>
+      </w:r>
+      <w:r>
+        <w:rPr>
+          <w:rFonts w:ascii="Courier New" w:eastAsia="Times New Roman" w:hAnsi="Courier New" w:cs="Courier New"/>
+          <w:kern w:val="0"/>
+          <w:sz w:val="20"/>
+          <w:szCs w:val="20"/>
+          <w14:ligatures w14:val="none"/>
+        </w:rPr>
+        <w:t xml:space="preserve">#v1.5.0</w:t>
+      </w:r>
+      <w:r>
+        <w:rPr>
+          <w:rFonts w:ascii="Times New Roman" w:eastAsia="Times New Roman" w:hAnsi="Times New Roman" w:cs="Times New Roman"/>
+          <w:kern w:val="0"/>
+          <w14:ligatures w14:val="none"/>
+        </w:rPr>
+        <w:t xml:space="preserve">). This updates the tag in </w:t>
       </w:r>
       <w:r>
         <w:rPr>
@@ -785,7 +803,61 @@
           <w:kern w:val="0"/>
           <w14:ligatures w14:val="none"/>
         </w:rPr>
-        <w:t xml:space="preserve"> to the new release tag.</w:t>
+        <w:t xml:space="preserve"> and the pinned commit in </w:t>
+      </w:r>
+      <w:r>
+        <w:rPr>
+          <w:rFonts w:ascii="Courier New" w:eastAsia="Times New Roman" w:hAnsi="Courier New" w:cs="Courier New"/>
+          <w:kern w:val="0"/>
+          <w:sz w:val="20"/>
+          <w:szCs w:val="20"/>
+          <w14:ligatures w14:val="none"/>
+        </w:rPr>
+        <w:t xml:space="preserve">package-lock.json</w:t>
+      </w:r>
+      <w:r>
+        <w:rPr>
+          <w:rFonts w:ascii="Times New Roman" w:eastAsia="Times New Roman" w:hAnsi="Times New Roman" w:cs="Times New Roman"/>
+          <w:kern w:val="0"/>
+          <w14:ligatures w14:val="none"/>
+        </w:rPr>
+        <w:t xml:space="preserve"> together. Changing the tag in </w:t>
+      </w:r>
+      <w:r>
+        <w:rPr>
+          <w:rFonts w:ascii="Courier New" w:eastAsia="Times New Roman" w:hAnsi="Courier New" w:cs="Courier New"/>
+          <w:kern w:val="0"/>
+          <w:sz w:val="20"/>
+          <w:szCs w:val="20"/>
+          <w14:ligatures w14:val="none"/>
+        </w:rPr>
+        <w:t xml:space="preserve">package.json</w:t>
+      </w:r>
+      <w:r>
+        <w:rPr>
+          <w:rFonts w:ascii="Times New Roman" w:eastAsia="Times New Roman" w:hAnsi="Times New Roman" w:cs="Times New Roman"/>
+          <w:kern w:val="0"/>
+          <w14:ligatures w14:val="none"/>
+        </w:rPr>
+        <w:t xml:space="preserve"> and running a plain </w:t>
+      </w:r>
+      <w:r>
+        <w:rPr>
+          <w:rFonts w:ascii="Courier New" w:eastAsia="Times New Roman" w:hAnsi="Courier New" w:cs="Courier New"/>
+          <w:kern w:val="0"/>
+          <w:sz w:val="20"/>
+          <w:szCs w:val="20"/>
+          <w14:ligatures w14:val="none"/>
+        </w:rPr>
+        <w:t xml:space="preserve">npm install</w:t>
+      </w:r>
+      <w:r>
+        <w:rPr>
+          <w:rFonts w:ascii="Times New Roman" w:eastAsia="Times New Roman" w:hAnsi="Times New Roman" w:cs="Times New Roman"/>
+          <w:kern w:val="0"/>
+          <w14:ligatures w14:val="none"/>
+        </w:rPr>
+        <w:t xml:space="preserve"> is not enough: the lockfile keeps the old commit and npm reports “up to date”.</w:t>
       </w:r>
     </w:p>
     <w:p>
@@ -807,25 +879,25 @@
           <w:kern w:val="0"/>
           <w14:ligatures w14:val="none"/>
         </w:rPr>
-        <w:t xml:space="preserve">Run </w:t>
-      </w:r>
-      <w:r>
-        <w:rPr>
-          <w:rFonts w:ascii="Courier New" w:eastAsia="Times New Roman" w:hAnsi="Courier New" w:cs="Courier New"/>
-          <w:kern w:val="0"/>
-          <w:sz w:val="20"/>
-          <w:szCs w:val="20"/>
-          <w14:ligatures w14:val="none"/>
-        </w:rPr>
-        <w:t xml:space="preserve">npm install</w:t>
-      </w:r>
-      <w:r>
-        <w:rPr>
-          <w:rFonts w:ascii="Times New Roman" w:eastAsia="Times New Roman" w:hAnsi="Times New Roman" w:cs="Times New Roman"/>
-          <w:kern w:val="0"/>
-          <w14:ligatures w14:val="none"/>
-        </w:rPr>
-        <w:t xml:space="preserve">.</w:t>
+        <w:t xml:space="preserve">Check the version: </w:t>
+      </w:r>
+      <w:r>
+        <w:rPr>
+          <w:rFonts w:ascii="Courier New" w:eastAsia="Times New Roman" w:hAnsi="Courier New" w:cs="Courier New"/>
+          <w:kern w:val="0"/>
+          <w:sz w:val="20"/>
+          <w:szCs w:val="20"/>
+          <w14:ligatures w14:val="none"/>
+        </w:rPr>
+        <w:t xml:space="preserve">node_modules/@winsomemundy/design-system/package.json</w:t>
+      </w:r>
+      <w:r>
+        <w:rPr>
+          <w:rFonts w:ascii="Times New Roman" w:eastAsia="Times New Roman" w:hAnsi="Times New Roman" w:cs="Times New Roman"/>
+          <w:kern w:val="0"/>
+          <w14:ligatures w14:val="none"/>
+        </w:rPr>
+        <w:t xml:space="preserve"> should show the new release.</w:t>
       </w:r>
     </w:p>
     <w:p>
@@ -847,7 +919,61 @@
           <w:kern w:val="0"/>
           <w14:ligatures w14:val="none"/>
         </w:rPr>
-        <w:t xml:space="preserve">Follow the release steps above, starting at step 2.</w:t>
+        <w:t xml:space="preserve">Follow the release steps above, starting at step 2, and commit </w:t>
+      </w:r>
+      <w:r>
+        <w:rPr>
+          <w:rFonts w:ascii="Courier New" w:eastAsia="Times New Roman" w:hAnsi="Courier New" w:cs="Courier New"/>
+          <w:kern w:val="0"/>
+          <w:sz w:val="20"/>
+          <w:szCs w:val="20"/>
+          <w14:ligatures w14:val="none"/>
+        </w:rPr>
+        <w:t xml:space="preserve">package.json</w:t>
+      </w:r>
+      <w:r>
+        <w:rPr>
+          <w:rFonts w:ascii="Times New Roman" w:eastAsia="Times New Roman" w:hAnsi="Times New Roman" w:cs="Times New Roman"/>
+          <w:kern w:val="0"/>
+          <w14:ligatures w14:val="none"/>
+        </w:rPr>
+        <w:t xml:space="preserve"> and </w:t>
+      </w:r>
+      <w:r>
+        <w:rPr>
+          <w:rFonts w:ascii="Courier New" w:eastAsia="Times New Roman" w:hAnsi="Courier New" w:cs="Courier New"/>
+          <w:kern w:val="0"/>
+          <w:sz w:val="20"/>
+          <w:szCs w:val="20"/>
+          <w14:ligatures w14:val="none"/>
+        </w:rPr>
+        <w:t xml:space="preserve">package-lock.json</w:t>
+      </w:r>
+      <w:r>
+        <w:rPr>
+          <w:rFonts w:ascii="Times New Roman" w:eastAsia="Times New Roman" w:hAnsi="Times New Roman" w:cs="Times New Roman"/>
+          <w:kern w:val="0"/>
+          <w14:ligatures w14:val="none"/>
+        </w:rPr>
+        <w:t xml:space="preserve"> along with </w:t>
+      </w:r>
+      <w:r>
+        <w:rPr>
+          <w:rFonts w:ascii="Courier New" w:eastAsia="Times New Roman" w:hAnsi="Courier New" w:cs="Courier New"/>
+          <w:kern w:val="0"/>
+          <w:sz w:val="20"/>
+          <w:szCs w:val="20"/>
+          <w14:ligatures w14:val="none"/>
+        </w:rPr>
+        <w:t xml:space="preserve">sieve.html</w:t>
+      </w:r>
+      <w:r>
+        <w:rPr>
+          <w:rFonts w:ascii="Times New Roman" w:eastAsia="Times New Roman" w:hAnsi="Times New Roman" w:cs="Times New Roman"/>
+          <w:kern w:val="0"/>
+          <w14:ligatures w14:val="none"/>
+        </w:rPr>
+        <w:t xml:space="preserve">.</w:t>
       </w:r>
     </w:p>
     <w:p/>

</xml_diff>

<commit_message>
Add the printable worksheet to the Word instructions
Co-Authored-By: Claude Opus 5.5 <noreply@anthropic.com>
</commit_message>
<xml_diff>
--- a/docs/Instructions for Sieve of Eratosthenes.docx
+++ b/docs/Instructions for Sieve of Eratosthenes.docx
@@ -974,6 +974,370 @@
           <w14:ligatures w14:val="none"/>
         </w:rPr>
         <w:t xml:space="preserve">.</w:t>
+      </w:r>
+    </w:p>
+    <w:p>
+      <w:pPr>
+        <w:spacing w:before="100" w:beforeAutospacing="1" w:after="100" w:afterAutospacing="1" w:line="240" w:lineRule="auto"/>
+        <w:rPr>
+          <w:rFonts w:ascii="Times New Roman" w:eastAsia="Times New Roman" w:hAnsi="Times New Roman" w:cs="Times New Roman"/>
+          <w:kern w:val="0"/>
+          <w14:ligatures w14:val="none"/>
+        </w:rPr>
+      </w:pPr>
+      <w:r>
+        <w:rPr>
+          <w:rFonts w:ascii="Times New Roman" w:eastAsia="Times New Roman" w:hAnsi="Times New Roman" w:cs="Times New Roman"/>
+          <w:kern w:val="0"/>
+          <w14:ligatures w14:val="none"/>
+        </w:rPr>
+        <w:t xml:space="preserve">PRINTABLE WORKSHEET</w:t>
+      </w:r>
+    </w:p>
+    <w:p>
+      <w:pPr>
+        <w:spacing w:before="100" w:beforeAutospacing="1" w:after="100" w:afterAutospacing="1" w:line="240" w:lineRule="auto"/>
+        <w:rPr>
+          <w:rFonts w:ascii="Times New Roman" w:eastAsia="Times New Roman" w:hAnsi="Times New Roman" w:cs="Times New Roman"/>
+          <w:kern w:val="0"/>
+          <w14:ligatures w14:val="none"/>
+        </w:rPr>
+      </w:pPr>
+      <w:r>
+        <w:rPr>
+          <w:rFonts w:ascii="Times New Roman" w:eastAsia="Times New Roman" w:hAnsi="Times New Roman" w:cs="Times New Roman"/>
+          <w:kern w:val="0"/>
+          <w14:ligatures w14:val="none"/>
+        </w:rPr>
+        <w:t xml:space="preserve">The tool prints a worksheet for whatever number is on the grid. All of it lives in </w:t>
+      </w:r>
+      <w:r>
+        <w:rPr>
+          <w:rFonts w:ascii="Courier New" w:eastAsia="Times New Roman" w:hAnsi="Courier New" w:cs="Courier New"/>
+          <w:kern w:val="0"/>
+          <w:sz w:val="20"/>
+          <w:szCs w:val="20"/>
+          <w14:ligatures w14:val="none"/>
+        </w:rPr>
+        <w:t xml:space="preserve">index.html</w:t>
+      </w:r>
+      <w:r>
+        <w:rPr>
+          <w:rFonts w:ascii="Times New Roman" w:eastAsia="Times New Roman" w:hAnsi="Times New Roman" w:cs="Times New Roman"/>
+          <w:kern w:val="0"/>
+          <w14:ligatures w14:val="none"/>
+        </w:rPr>
+        <w:t xml:space="preserve">, so the release steps above still apply.</w:t>
+      </w:r>
+    </w:p>
+    <w:p>
+      <w:pPr>
+        <w:numPr>
+          <w:ilvl w:val="0"/>
+          <w:numId w:val="1"/>
+        </w:numPr>
+        <w:spacing w:before="100" w:beforeAutospacing="1" w:after="100" w:afterAutospacing="1" w:line="240" w:lineRule="auto"/>
+        <w:rPr>
+          <w:rFonts w:ascii="Times New Roman" w:eastAsia="Times New Roman" w:hAnsi="Times New Roman" w:cs="Times New Roman"/>
+          <w:kern w:val="0"/>
+          <w14:ligatures w14:val="none"/>
+        </w:rPr>
+      </w:pPr>
+      <w:r>
+        <w:rPr>
+          <w:rFonts w:ascii="Times New Roman" w:eastAsia="Times New Roman" w:hAnsi="Times New Roman" w:cs="Times New Roman"/>
+          <w:b/>
+          <w:bCs/>
+          <w:kern w:val="0"/>
+          <w14:ligatures w14:val="none"/>
+        </w:rPr>
+        <w:t xml:space="preserve">What students see.</w:t>
+      </w:r>
+      <w:r>
+        <w:rPr>
+          <w:rFonts w:ascii="Times New Roman" w:eastAsia="Times New Roman" w:hAnsi="Times New Roman" w:cs="Times New Roman"/>
+          <w:kern w:val="0"/>
+          <w14:ligatures w14:val="none"/>
+        </w:rPr>
+        <w:t xml:space="preserve"> The “Your number” card has a “Print a worksheet for n” button and an “Include the answer key” checkbox. The button opens the print window; choosing Save as PDF downloads the sheet.</w:t>
+      </w:r>
+    </w:p>
+    <w:p>
+      <w:pPr>
+        <w:numPr>
+          <w:ilvl w:val="0"/>
+          <w:numId w:val="1"/>
+        </w:numPr>
+        <w:spacing w:before="100" w:beforeAutospacing="1" w:after="100" w:afterAutospacing="1" w:line="240" w:lineRule="auto"/>
+        <w:rPr>
+          <w:rFonts w:ascii="Times New Roman" w:eastAsia="Times New Roman" w:hAnsi="Times New Roman" w:cs="Times New Roman"/>
+          <w:kern w:val="0"/>
+          <w14:ligatures w14:val="none"/>
+        </w:rPr>
+      </w:pPr>
+      <w:r>
+        <w:rPr>
+          <w:rFonts w:ascii="Times New Roman" w:eastAsia="Times New Roman" w:hAnsi="Times New Roman" w:cs="Times New Roman"/>
+          <w:b/>
+          <w:bCs/>
+          <w:kern w:val="0"/>
+          <w14:ligatures w14:val="none"/>
+        </w:rPr>
+        <w:t xml:space="preserve">What it prints.</w:t>
+      </w:r>
+      <w:r>
+        <w:rPr>
+          <w:rFonts w:ascii="Times New Roman" w:eastAsia="Times New Roman" w:hAnsi="Times New Roman" w:cs="Times New Roman"/>
+          <w:kern w:val="0"/>
+          <w14:ligatures w14:val="none"/>
+        </w:rPr>
+        <w:t xml:space="preserve"> Name and Date lines, pencil instructions with √n worked out, the grid from 1 to n (rows of 10 up to 100, rows of 20 above), and five questions. With the key, a final teacher’s page gives every answer and all the primes.</w:t>
+      </w:r>
+    </w:p>
+    <w:p>
+      <w:pPr>
+        <w:numPr>
+          <w:ilvl w:val="0"/>
+          <w:numId w:val="1"/>
+        </w:numPr>
+        <w:spacing w:before="100" w:beforeAutospacing="1" w:after="100" w:afterAutospacing="1" w:line="240" w:lineRule="auto"/>
+        <w:rPr>
+          <w:rFonts w:ascii="Times New Roman" w:eastAsia="Times New Roman" w:hAnsi="Times New Roman" w:cs="Times New Roman"/>
+          <w:kern w:val="0"/>
+          <w14:ligatures w14:val="none"/>
+        </w:rPr>
+      </w:pPr>
+      <w:r>
+        <w:rPr>
+          <w:rFonts w:ascii="Times New Roman" w:eastAsia="Times New Roman" w:hAnsi="Times New Roman" w:cs="Times New Roman"/>
+          <w:b/>
+          <w:bCs/>
+          <w:kern w:val="0"/>
+          <w14:ligatures w14:val="none"/>
+        </w:rPr>
+        <w:t xml:space="preserve">Where the code is.</w:t>
+      </w:r>
+      <w:r>
+        <w:rPr>
+          <w:rFonts w:ascii="Times New Roman" w:eastAsia="Times New Roman" w:hAnsi="Times New Roman" w:cs="Times New Roman"/>
+          <w:kern w:val="0"/>
+          <w14:ligatures w14:val="none"/>
+        </w:rPr>
+        <w:t xml:space="preserve"> The </w:t>
+      </w:r>
+      <w:r>
+        <w:rPr>
+          <w:rFonts w:ascii="Courier New" w:eastAsia="Times New Roman" w:hAnsi="Courier New" w:cs="Courier New"/>
+          <w:kern w:val="0"/>
+          <w:sz w:val="20"/>
+          <w:szCs w:val="20"/>
+          <w14:ligatures w14:val="none"/>
+        </w:rPr>
+        <w:t xml:space="preserve">worksheet()</w:t>
+      </w:r>
+      <w:r>
+        <w:rPr>
+          <w:rFonts w:ascii="Times New Roman" w:eastAsia="Times New Roman" w:hAnsi="Times New Roman" w:cs="Times New Roman"/>
+          <w:kern w:val="0"/>
+          <w14:ligatures w14:val="none"/>
+        </w:rPr>
+        <w:t xml:space="preserve"> function in the script builds the sheet. The CSS under “Printable worksheet” styles it and applies only when printing.</w:t>
+      </w:r>
+    </w:p>
+    <w:p>
+      <w:pPr>
+        <w:numPr>
+          <w:ilvl w:val="0"/>
+          <w:numId w:val="1"/>
+        </w:numPr>
+        <w:spacing w:before="100" w:beforeAutospacing="1" w:after="100" w:afterAutospacing="1" w:line="240" w:lineRule="auto"/>
+        <w:rPr>
+          <w:rFonts w:ascii="Times New Roman" w:eastAsia="Times New Roman" w:hAnsi="Times New Roman" w:cs="Times New Roman"/>
+          <w:kern w:val="0"/>
+          <w14:ligatures w14:val="none"/>
+        </w:rPr>
+      </w:pPr>
+      <w:r>
+        <w:rPr>
+          <w:rFonts w:ascii="Times New Roman" w:eastAsia="Times New Roman" w:hAnsi="Times New Roman" w:cs="Times New Roman"/>
+          <w:b/>
+          <w:bCs/>
+          <w:kern w:val="0"/>
+          <w14:ligatures w14:val="none"/>
+        </w:rPr>
+        <w:t xml:space="preserve">Page layout.</w:t>
+      </w:r>
+      <w:r>
+        <w:rPr>
+          <w:rFonts w:ascii="Times New Roman" w:eastAsia="Times New Roman" w:hAnsi="Times New Roman" w:cs="Times New Roman"/>
+          <w:kern w:val="0"/>
+          <w14:ligatures w14:val="none"/>
+        </w:rPr>
+        <w:t xml:space="preserve"> Up to 50 the sheet fits on one page. When the grid fills page 1, the questions start on page 2; when the grid runs over several pages, they follow straight after it. The cutoffs (50 mm and 160 mm of grid) are in </w:t>
+      </w:r>
+      <w:r>
+        <w:rPr>
+          <w:rFonts w:ascii="Courier New" w:eastAsia="Times New Roman" w:hAnsi="Courier New" w:cs="Courier New"/>
+          <w:kern w:val="0"/>
+          <w:sz w:val="20"/>
+          <w:szCs w:val="20"/>
+          <w14:ligatures w14:val="none"/>
+        </w:rPr>
+        <w:t xml:space="preserve">worksheet()</w:t>
+      </w:r>
+      <w:r>
+        <w:rPr>
+          <w:rFonts w:ascii="Times New Roman" w:eastAsia="Times New Roman" w:hAnsi="Times New Roman" w:cs="Times New Roman"/>
+          <w:kern w:val="0"/>
+          <w14:ligatures w14:val="none"/>
+        </w:rPr>
+        <w:t xml:space="preserve">. Adjust them if you change the grid or question sizes.</w:t>
+      </w:r>
+    </w:p>
+    <w:p>
+      <w:pPr>
+        <w:numPr>
+          <w:ilvl w:val="0"/>
+          <w:numId w:val="1"/>
+        </w:numPr>
+        <w:spacing w:before="100" w:beforeAutospacing="1" w:after="100" w:afterAutospacing="1" w:line="240" w:lineRule="auto"/>
+        <w:rPr>
+          <w:rFonts w:ascii="Times New Roman" w:eastAsia="Times New Roman" w:hAnsi="Times New Roman" w:cs="Times New Roman"/>
+          <w:kern w:val="0"/>
+          <w14:ligatures w14:val="none"/>
+        </w:rPr>
+      </w:pPr>
+      <w:r>
+        <w:rPr>
+          <w:rFonts w:ascii="Times New Roman" w:eastAsia="Times New Roman" w:hAnsi="Times New Roman" w:cs="Times New Roman"/>
+          <w:b/>
+          <w:bCs/>
+          <w:kern w:val="0"/>
+          <w14:ligatures w14:val="none"/>
+        </w:rPr>
+        <w:t xml:space="preserve">Artifact.</w:t>
+      </w:r>
+      <w:r>
+        <w:rPr>
+          <w:rFonts w:ascii="Times New Roman" w:eastAsia="Times New Roman" w:hAnsi="Times New Roman" w:cs="Times New Roman"/>
+          <w:kern w:val="0"/>
+          <w14:ligatures w14:val="none"/>
+        </w:rPr>
+        <w:t xml:space="preserve"> The artifact viewer may block the print window, so students should print from sieve.winsomemundy.com.</w:t>
+      </w:r>
+    </w:p>
+    <w:p>
+      <w:pPr>
+        <w:spacing w:before="100" w:beforeAutospacing="1" w:after="100" w:afterAutospacing="1" w:line="240" w:lineRule="auto"/>
+        <w:rPr>
+          <w:rFonts w:ascii="Times New Roman" w:eastAsia="Times New Roman" w:hAnsi="Times New Roman" w:cs="Times New Roman"/>
+          <w:kern w:val="0"/>
+          <w14:ligatures w14:val="none"/>
+        </w:rPr>
+      </w:pPr>
+      <w:r>
+        <w:rPr>
+          <w:rFonts w:ascii="Times New Roman" w:eastAsia="Times New Roman" w:hAnsi="Times New Roman" w:cs="Times New Roman"/>
+          <w:kern w:val="0"/>
+          <w14:ligatures w14:val="none"/>
+        </w:rPr>
+        <w:t xml:space="preserve">Before releasing a change that touches the worksheet, print it to PDF at three numbers:</w:t>
+      </w:r>
+    </w:p>
+    <w:p>
+      <w:pPr>
+        <w:numPr>
+          <w:ilvl w:val="0"/>
+          <w:numId w:val="1"/>
+        </w:numPr>
+        <w:spacing w:before="100" w:beforeAutospacing="1" w:after="100" w:afterAutospacing="1" w:line="240" w:lineRule="auto"/>
+        <w:rPr>
+          <w:rFonts w:ascii="Times New Roman" w:eastAsia="Times New Roman" w:hAnsi="Times New Roman" w:cs="Times New Roman"/>
+          <w:kern w:val="0"/>
+          <w14:ligatures w14:val="none"/>
+        </w:rPr>
+      </w:pPr>
+      <w:r>
+        <w:rPr>
+          <w:rFonts w:ascii="Times New Roman" w:eastAsia="Times New Roman" w:hAnsi="Times New Roman" w:cs="Times New Roman"/>
+          <w:b/>
+          <w:bCs/>
+          <w:kern w:val="0"/>
+          <w14:ligatures w14:val="none"/>
+        </w:rPr>
+        <w:t xml:space="preserve">50 with the key:</w:t>
+      </w:r>
+      <w:r>
+        <w:rPr>
+          <w:rFonts w:ascii="Times New Roman" w:eastAsia="Times New Roman" w:hAnsi="Times New Roman" w:cs="Times New Roman"/>
+          <w:kern w:val="0"/>
+          <w14:ligatures w14:val="none"/>
+        </w:rPr>
+        <w:t xml:space="preserve"> one worksheet page plus the key page; 15 primes, sieved with 2, 3, 5 and 7.</w:t>
+      </w:r>
+    </w:p>
+    <w:p>
+      <w:pPr>
+        <w:numPr>
+          <w:ilvl w:val="0"/>
+          <w:numId w:val="1"/>
+        </w:numPr>
+        <w:spacing w:before="100" w:beforeAutospacing="1" w:after="100" w:afterAutospacing="1" w:line="240" w:lineRule="auto"/>
+        <w:rPr>
+          <w:rFonts w:ascii="Times New Roman" w:eastAsia="Times New Roman" w:hAnsi="Times New Roman" w:cs="Times New Roman"/>
+          <w:kern w:val="0"/>
+          <w14:ligatures w14:val="none"/>
+        </w:rPr>
+      </w:pPr>
+      <w:r>
+        <w:rPr>
+          <w:rFonts w:ascii="Times New Roman" w:eastAsia="Times New Roman" w:hAnsi="Times New Roman" w:cs="Times New Roman"/>
+          <w:b/>
+          <w:bCs/>
+          <w:kern w:val="0"/>
+          <w14:ligatures w14:val="none"/>
+        </w:rPr>
+        <w:t xml:space="preserve">100:</w:t>
+      </w:r>
+      <w:r>
+        <w:rPr>
+          <w:rFonts w:ascii="Times New Roman" w:eastAsia="Times New Roman" w:hAnsi="Times New Roman" w:cs="Times New Roman"/>
+          <w:kern w:val="0"/>
+          <w14:ligatures w14:val="none"/>
+        </w:rPr>
+        <w:t xml:space="preserve"> the grid on page 1 and the questions on page 2.</w:t>
+      </w:r>
+    </w:p>
+    <w:p>
+      <w:pPr>
+        <w:numPr>
+          <w:ilvl w:val="0"/>
+          <w:numId w:val="1"/>
+        </w:numPr>
+        <w:spacing w:before="100" w:beforeAutospacing="1" w:after="100" w:afterAutospacing="1" w:line="240" w:lineRule="auto"/>
+        <w:rPr>
+          <w:rFonts w:ascii="Times New Roman" w:eastAsia="Times New Roman" w:hAnsi="Times New Roman" w:cs="Times New Roman"/>
+          <w:kern w:val="0"/>
+          <w14:ligatures w14:val="none"/>
+        </w:rPr>
+      </w:pPr>
+      <w:r>
+        <w:rPr>
+          <w:rFonts w:ascii="Times New Roman" w:eastAsia="Times New Roman" w:hAnsi="Times New Roman" w:cs="Times New Roman"/>
+          <w:b/>
+          <w:bCs/>
+          <w:kern w:val="0"/>
+          <w14:ligatures w14:val="none"/>
+        </w:rPr>
+        <w:t xml:space="preserve">1,000 with the key:</w:t>
+      </w:r>
+      <w:r>
+        <w:rPr>
+          <w:rFonts w:ascii="Times New Roman" w:eastAsia="Times New Roman" w:hAnsi="Times New Roman" w:cs="Times New Roman"/>
+          <w:kern w:val="0"/>
+          <w14:ligatures w14:val="none"/>
+        </w:rPr>
+        <w:t xml:space="preserve"> the questions follow the grid on page 3, and the key lists 168 primes.</w:t>
       </w:r>
     </w:p>
     <w:p/>

</xml_diff>

<commit_message>
Word guide: opening on a number and the artifact's worksheet link
Co-Authored-By: Claude Opus 5.5 <noreply@anthropic.com>
</commit_message>
<xml_diff>
--- a/docs/Instructions for Sieve of Eratosthenes.docx
+++ b/docs/Instructions for Sieve of Eratosthenes.docx
@@ -1215,6 +1215,92 @@
           <w:kern w:val="0"/>
           <w14:ligatures w14:val="none"/>
         </w:rPr>
+        <w:t xml:space="preserve">Opening on a number.</w:t>
+      </w:r>
+      <w:r>
+        <w:rPr>
+          <w:rFonts w:ascii="Times New Roman" w:eastAsia="Times New Roman" w:hAnsi="Times New Roman" w:cs="Times New Roman"/>
+          <w:kern w:val="0"/>
+          <w14:ligatures w14:val="none"/>
+        </w:rPr>
+        <w:t xml:space="preserve"> A link can start the tool on any number: </w:t>
+      </w:r>
+      <w:r>
+        <w:rPr>
+          <w:rFonts w:ascii="Courier New" w:eastAsia="Times New Roman" w:hAnsi="Courier New" w:cs="Courier New"/>
+          <w:kern w:val="0"/>
+          <w:sz w:val="20"/>
+          <w:szCs w:val="20"/>
+          <w14:ligatures w14:val="none"/>
+        </w:rPr>
+        <w:t xml:space="preserve">?n=120</w:t>
+      </w:r>
+      <w:r>
+        <w:rPr>
+          <w:rFonts w:ascii="Times New Roman" w:eastAsia="Times New Roman" w:hAnsi="Times New Roman" w:cs="Times New Roman"/>
+          <w:kern w:val="0"/>
+          <w14:ligatures w14:val="none"/>
+        </w:rPr>
+        <w:t xml:space="preserve"> opens sieve.winsomemundy.com on 120 with its grid built, and adding </w:t>
+      </w:r>
+      <w:r>
+        <w:rPr>
+          <w:rFonts w:ascii="Courier New" w:eastAsia="Times New Roman" w:hAnsi="Courier New" w:cs="Courier New"/>
+          <w:kern w:val="0"/>
+          <w:sz w:val="20"/>
+          <w:szCs w:val="20"/>
+          <w14:ligatures w14:val="none"/>
+        </w:rPr>
+        <w:t xml:space="preserve">&amp;key=1</w:t>
+      </w:r>
+      <w:r>
+        <w:rPr>
+          <w:rFonts w:ascii="Times New Roman" w:eastAsia="Times New Roman" w:hAnsi="Times New Roman" w:cs="Times New Roman"/>
+          <w:kern w:val="0"/>
+          <w14:ligatures w14:val="none"/>
+        </w:rPr>
+        <w:t xml:space="preserve"> ticks “Include the answer key”. A missing or invalid number falls back to 50. The code is at the end of the script in </w:t>
+      </w:r>
+      <w:r>
+        <w:rPr>
+          <w:rFonts w:ascii="Courier New" w:eastAsia="Times New Roman" w:hAnsi="Courier New" w:cs="Courier New"/>
+          <w:kern w:val="0"/>
+          <w:sz w:val="20"/>
+          <w:szCs w:val="20"/>
+          <w14:ligatures w14:val="none"/>
+        </w:rPr>
+        <w:t xml:space="preserve">index.html</w:t>
+      </w:r>
+      <w:r>
+        <w:rPr>
+          <w:rFonts w:ascii="Times New Roman" w:eastAsia="Times New Roman" w:hAnsi="Times New Roman" w:cs="Times New Roman"/>
+          <w:kern w:val="0"/>
+          <w14:ligatures w14:val="none"/>
+        </w:rPr>
+        <w:t xml:space="preserve">.</w:t>
+      </w:r>
+    </w:p>
+    <w:p>
+      <w:pPr>
+        <w:numPr>
+          <w:ilvl w:val="0"/>
+          <w:numId w:val="1"/>
+        </w:numPr>
+        <w:spacing w:before="100" w:beforeAutospacing="1" w:after="100" w:afterAutospacing="1" w:line="240" w:lineRule="auto"/>
+        <w:rPr>
+          <w:rFonts w:ascii="Times New Roman" w:eastAsia="Times New Roman" w:hAnsi="Times New Roman" w:cs="Times New Roman"/>
+          <w:kern w:val="0"/>
+          <w14:ligatures w14:val="none"/>
+        </w:rPr>
+      </w:pPr>
+      <w:r>
+        <w:rPr>
+          <w:rFonts w:ascii="Times New Roman" w:eastAsia="Times New Roman" w:hAnsi="Times New Roman" w:cs="Times New Roman"/>
+          <w:b/>
+          <w:bCs/>
+          <w:kern w:val="0"/>
+          <w14:ligatures w14:val="none"/>
+        </w:rPr>
         <w:t xml:space="preserve">Artifact.</w:t>
       </w:r>
       <w:r>
@@ -1223,7 +1309,79 @@
           <w:kern w:val="0"/>
           <w14:ligatures w14:val="none"/>
         </w:rPr>
-        <w:t xml:space="preserve"> The artifact viewer may block the print window, so students should print from sieve.winsomemundy.com.</w:t>
+        <w:t xml:space="preserve"> The artifact viewer can’t open a print window, so in the artifact the button reads “Print a worksheet for n ↗” and opens the live Sieve in a new tab on the same number and answer-key choice, ready to print. </w:t>
+      </w:r>
+      <w:r>
+        <w:rPr>
+          <w:rFonts w:ascii="Courier New" w:eastAsia="Times New Roman" w:hAnsi="Courier New" w:cs="Courier New"/>
+          <w:kern w:val="0"/>
+          <w:sz w:val="20"/>
+          <w:szCs w:val="20"/>
+          <w14:ligatures w14:val="none"/>
+        </w:rPr>
+        <w:t xml:space="preserve">make-artifact.mjs</w:t>
+      </w:r>
+      <w:r>
+        <w:rPr>
+          <w:rFonts w:ascii="Times New Roman" w:eastAsia="Times New Roman" w:hAnsi="Times New Roman" w:cs="Times New Roman"/>
+          <w:kern w:val="0"/>
+          <w14:ligatures w14:val="none"/>
+        </w:rPr>
+        <w:t xml:space="preserve"> makes this swap when it builds </w:t>
+      </w:r>
+      <w:r>
+        <w:rPr>
+          <w:rFonts w:ascii="Courier New" w:eastAsia="Times New Roman" w:hAnsi="Courier New" w:cs="Courier New"/>
+          <w:kern w:val="0"/>
+          <w:sz w:val="20"/>
+          <w:szCs w:val="20"/>
+          <w14:ligatures w14:val="none"/>
+        </w:rPr>
+        <w:t xml:space="preserve">sieve.html</w:t>
+      </w:r>
+      <w:r>
+        <w:rPr>
+          <w:rFonts w:ascii="Times New Roman" w:eastAsia="Times New Roman" w:hAnsi="Times New Roman" w:cs="Times New Roman"/>
+          <w:kern w:val="0"/>
+          <w14:ligatures w14:val="none"/>
+        </w:rPr>
+        <w:t xml:space="preserve">. If you change the button or its hint in </w:t>
+      </w:r>
+      <w:r>
+        <w:rPr>
+          <w:rFonts w:ascii="Courier New" w:eastAsia="Times New Roman" w:hAnsi="Courier New" w:cs="Courier New"/>
+          <w:kern w:val="0"/>
+          <w:sz w:val="20"/>
+          <w:szCs w:val="20"/>
+          <w14:ligatures w14:val="none"/>
+        </w:rPr>
+        <w:t xml:space="preserve">index.html</w:t>
+      </w:r>
+      <w:r>
+        <w:rPr>
+          <w:rFonts w:ascii="Times New Roman" w:eastAsia="Times New Roman" w:hAnsi="Times New Roman" w:cs="Times New Roman"/>
+          <w:kern w:val="0"/>
+          <w14:ligatures w14:val="none"/>
+        </w:rPr>
+        <w:t xml:space="preserve">, update the matching text in </w:t>
+      </w:r>
+      <w:r>
+        <w:rPr>
+          <w:rFonts w:ascii="Courier New" w:eastAsia="Times New Roman" w:hAnsi="Courier New" w:cs="Courier New"/>
+          <w:kern w:val="0"/>
+          <w:sz w:val="20"/>
+          <w:szCs w:val="20"/>
+          <w14:ligatures w14:val="none"/>
+        </w:rPr>
+        <w:t xml:space="preserve">make-artifact.mjs</w:t>
+      </w:r>
+      <w:r>
+        <w:rPr>
+          <w:rFonts w:ascii="Times New Roman" w:eastAsia="Times New Roman" w:hAnsi="Times New Roman" w:cs="Times New Roman"/>
+          <w:kern w:val="0"/>
+          <w14:ligatures w14:val="none"/>
+        </w:rPr>
+        <w:t xml:space="preserve">; the build stops with an error if it can’t find it. To check it, open the artifact, build 120, tick the key and click the button: the live Sieve should open on 120 with the key ticked.</w:t>
       </w:r>
     </w:p>
     <w:p>

</xml_diff>